<commit_message>
dbdef fix and er fix
</commit_message>
<xml_diff>
--- a/Lab1/er.docx
+++ b/Lab1/er.docx
@@ -8,9 +8,88 @@
       </w:pPr>
       <w:r>
         <w:drawing>
-          <wp:inline distT="0" distB="0" distL="0" distR="0" wp14:anchorId="516C6C0A" wp14:editId="51D03D4D">
-            <wp:extent cx="7304333" cy="4267200"/>
+          <wp:anchor distT="0" distB="0" distL="114300" distR="114300" simplePos="0" relativeHeight="251659264" behindDoc="1" locked="0" layoutInCell="1" allowOverlap="1" wp14:anchorId="1BD01AB7" wp14:editId="30C448AE">
+            <wp:simplePos x="0" y="0"/>
+            <wp:positionH relativeFrom="column">
+              <wp:posOffset>-885825</wp:posOffset>
+            </wp:positionH>
+            <wp:positionV relativeFrom="paragraph">
+              <wp:posOffset>0</wp:posOffset>
+            </wp:positionV>
+            <wp:extent cx="5124450" cy="6495598"/>
+            <wp:effectExtent l="0" t="0" r="0" b="635"/>
+            <wp:wrapNone/>
+            <wp:docPr id="395889415" name="Picture 1"/>
+            <wp:cNvGraphicFramePr>
+              <a:graphicFrameLocks xmlns:a="http://schemas.openxmlformats.org/drawingml/2006/main" noChangeAspect="1"/>
+            </wp:cNvGraphicFramePr>
+            <a:graphic xmlns:a="http://schemas.openxmlformats.org/drawingml/2006/main">
+              <a:graphicData uri="http://schemas.openxmlformats.org/drawingml/2006/picture">
+                <pic:pic xmlns:pic="http://schemas.openxmlformats.org/drawingml/2006/picture">
+                  <pic:nvPicPr>
+                    <pic:cNvPr id="395889415" name=""/>
+                    <pic:cNvPicPr/>
+                  </pic:nvPicPr>
+                  <pic:blipFill rotWithShape="1">
+                    <a:blip r:embed="rId4">
+                      <a:extLst>
+                        <a:ext uri="{28A0092B-C50C-407E-A947-70E740481C1C}">
+                          <a14:useLocalDpi xmlns:a14="http://schemas.microsoft.com/office/drawing/2010/main" val="0"/>
+                        </a:ext>
+                      </a:extLst>
+                    </a:blip>
+                    <a:srcRect l="1495"/>
+                    <a:stretch>
+                      <a:fillRect/>
+                    </a:stretch>
+                  </pic:blipFill>
+                  <pic:spPr bwMode="auto">
+                    <a:xfrm>
+                      <a:off x="0" y="0"/>
+                      <a:ext cx="5124450" cy="6495598"/>
+                    </a:xfrm>
+                    <a:prstGeom prst="rect">
+                      <a:avLst/>
+                    </a:prstGeom>
+                    <a:ln>
+                      <a:noFill/>
+                    </a:ln>
+                    <a:extLst>
+                      <a:ext uri="{53640926-AAD7-44D8-BBD7-CCE9431645EC}">
+                        <a14:shadowObscured xmlns:a14="http://schemas.microsoft.com/office/drawing/2010/main"/>
+                      </a:ext>
+                    </a:extLst>
+                  </pic:spPr>
+                </pic:pic>
+              </a:graphicData>
+            </a:graphic>
+            <wp14:sizeRelH relativeFrom="page">
+              <wp14:pctWidth>0</wp14:pctWidth>
+            </wp14:sizeRelH>
+            <wp14:sizeRelV relativeFrom="page">
+              <wp14:pctHeight>0</wp14:pctHeight>
+            </wp14:sizeRelV>
+          </wp:anchor>
+        </w:drawing>
+      </w:r>
+    </w:p>
+    <w:p>
+      <w:r>
+        <w:rPr>
+          <w:noProof/>
+        </w:rPr>
+        <w:drawing>
+          <wp:anchor distT="0" distB="0" distL="114300" distR="114300" simplePos="0" relativeHeight="251658240" behindDoc="0" locked="0" layoutInCell="1" allowOverlap="1" wp14:anchorId="516C6C0A" wp14:editId="08F1A921">
+            <wp:simplePos x="0" y="0"/>
+            <wp:positionH relativeFrom="column">
+              <wp:posOffset>3988435</wp:posOffset>
+            </wp:positionH>
+            <wp:positionV relativeFrom="paragraph">
+              <wp:posOffset>172085</wp:posOffset>
+            </wp:positionV>
+            <wp:extent cx="2573981" cy="4305300"/>
             <wp:effectExtent l="0" t="0" r="0" b="0"/>
+            <wp:wrapNone/>
             <wp:docPr id="1438705844" name="Picture 1"/>
             <wp:cNvGraphicFramePr>
               <a:graphicFrameLocks xmlns:a="http://schemas.openxmlformats.org/drawingml/2006/main" noChangeAspect="1"/>
@@ -22,29 +101,49 @@
                     <pic:cNvPr id="1438705844" name=""/>
                     <pic:cNvPicPr/>
                   </pic:nvPicPr>
-                  <pic:blipFill>
-                    <a:blip r:embed="rId4"/>
+                  <pic:blipFill rotWithShape="1">
+                    <a:blip r:embed="rId5">
+                      <a:extLst>
+                        <a:ext uri="{28A0092B-C50C-407E-A947-70E740481C1C}">
+                          <a14:useLocalDpi xmlns:a14="http://schemas.microsoft.com/office/drawing/2010/main" val="0"/>
+                        </a:ext>
+                      </a:extLst>
+                    </a:blip>
+                    <a:srcRect l="65076"/>
                     <a:stretch>
                       <a:fillRect/>
                     </a:stretch>
                   </pic:blipFill>
-                  <pic:spPr>
+                  <pic:spPr bwMode="auto">
                     <a:xfrm>
                       <a:off x="0" y="0"/>
-                      <a:ext cx="7326150" cy="4279945"/>
+                      <a:ext cx="2573981" cy="4305300"/>
                     </a:xfrm>
                     <a:prstGeom prst="rect">
                       <a:avLst/>
                     </a:prstGeom>
+                    <a:ln>
+                      <a:noFill/>
+                    </a:ln>
+                    <a:extLst>
+                      <a:ext uri="{53640926-AAD7-44D8-BBD7-CCE9431645EC}">
+                        <a14:shadowObscured xmlns:a14="http://schemas.microsoft.com/office/drawing/2010/main"/>
+                      </a:ext>
+                    </a:extLst>
                   </pic:spPr>
                 </pic:pic>
               </a:graphicData>
             </a:graphic>
-          </wp:inline>
+            <wp14:sizeRelH relativeFrom="page">
+              <wp14:pctWidth>0</wp14:pctWidth>
+            </wp14:sizeRelH>
+            <wp14:sizeRelV relativeFrom="page">
+              <wp14:pctHeight>0</wp14:pctHeight>
+            </wp14:sizeRelV>
+          </wp:anchor>
         </w:drawing>
       </w:r>
     </w:p>
-    <w:p/>
     <w:p>
       <w:pPr>
         <w:tabs>

</xml_diff>